<commit_message>
docx-reader 1.34.0: nil shading paints nothing for faint text too
The reader's faint test took a nil shading's fill for paint, so near-white
text over `nil` D9D9D9 was not faint. nil now paints nothing there, as in
the shading marks; tests on a run and a paragraph, with clear as control.

Word drawn for a paragraph's nil with a fill and for nil with a stray
themeFillShade, on a run and a paragraph, in both modes: nothing painted.

Co-Authored-By: Claude Opus 5.5 <noreply@anthropic.com>
</commit_message>
<xml_diff>
--- a/label-docx-reader/corpus/drawing-cases/shading-compat.docx
+++ b/label-docx-reader/corpus/drawing-cases/shading-compat.docx
@@ -150,6 +150,35 @@
         <w:rPr>
           <w:shd w:val="nil" w:color="FF0000" w:fill="FF0000"/>
         </w:rPr>
+        <w:t xml:space="preserve">                              </w:t>
+      </w:r>
+    </w:p>
+    <w:p>
+      <w:pPr>
+        <w:spacing w:before="0" w:after="0" w:line="480" w:lineRule="exact"/>
+      </w:pPr>
+      <w:r>
+        <w:rPr>
+          <w:shd w:val="nil" w:fill="D9D9D9" w:themeFillShade="BF"/>
+        </w:rPr>
+        <w:t xml:space="preserve">                              </w:t>
+      </w:r>
+    </w:p>
+    <w:p>
+      <w:pPr>
+        <w:shd w:val="nil" w:fill="D9D9D9"/>
+        <w:spacing w:before="0" w:after="0" w:line="480" w:lineRule="exact"/>
+      </w:pPr>
+      <w:r>
+        <w:t xml:space="preserve">                              </w:t>
+      </w:r>
+    </w:p>
+    <w:p>
+      <w:pPr>
+        <w:shd w:val="nil" w:fill="D9D9D9" w:themeFillShade="BF"/>
+        <w:spacing w:before="0" w:after="0" w:line="480" w:lineRule="exact"/>
+      </w:pPr>
+      <w:r>
         <w:t xml:space="preserve">                              </w:t>
       </w:r>
     </w:p>

</xml_diff>